<commit_message>
📄 DOCX firmado: 57230920000113 - 29/4/2026, 1:46:00 p.m.
</commit_message>
<xml_diff>
--- a/data/declaraciones/signed/57230920000113.docx
+++ b/data/declaraciones/signed/57230920000113.docx
@@ -4262,7 +4262,7 @@
         <w:rPr>
           <w:lang w:val="es-MX"/>
         </w:rPr>
-        <w:t xml:space="preserve">MARI ANDRELLO ILUSTRACOES LTDA</w:t>
+        <w:t xml:space="preserve">MARIANA CORREA GALVAO DE CASTRO ANDRELLO</w:t>
       </w:r>
       <w:proofErr w:type="spellStart"/>
       <w:r>
@@ -4457,7 +4457,7 @@
         <w:rPr>
           <w:lang w:val="es-MX"/>
         </w:rPr>
-        <w:t xml:space="preserve">: 13 de abril de 2026</w:t>
+        <w:t xml:space="preserve">: 29 de abril de 2026</w:t>
       </w:r>
       <w:proofErr w:type="spellStart"/>
       <w:r>

</xml_diff>